<commit_message>
i-JMR package: opt in to JMIR Preprints (author's choice)
Co-Authored-By: Claude Opus 5.5 <noreply@anthropic.com>
</commit_message>
<xml_diff>
--- a/submission/ijmr/cover-letter.docx
+++ b/submission/ijmr/cover-letter.docx
@@ -193,7 +193,13 @@
         <w:t xml:space="preserve"> </w:t>
       </w:r>
       <w:r>
-        <w:t xml:space="preserve">would prefer not to post a second preprint on JMIR Preprints. It has not been submitted to any other journal.</w:t>
+        <w:t xml:space="preserve">am happy for the submitted version to be posted on JMIR Preprints as well. It has not been submitted to any other</w:t>
+      </w:r>
+      <w:r>
+        <w:t xml:space="preserve"> </w:t>
+      </w:r>
+      <w:r>
+        <w:t xml:space="preserve">journal.</w:t>
       </w:r>
     </w:p>
     <w:p>

</xml_diff>

<commit_message>
i-JMR cover letter: transcripts are covered by the form's AI disclosure
Co-Authored-By: Claude Opus 5.5 <noreply@anthropic.com>
</commit_message>
<xml_diff>
--- a/submission/ijmr/cover-letter.docx
+++ b/submission/ijmr/cover-letter.docx
@@ -220,18 +220,6 @@
       </w:r>
       <w:r>
         <w:t xml:space="preserve">The submission form’s AI disclosure describes this use.</w:t>
-      </w:r>
-      <w:r>
-        <w:t xml:space="preserve"> </w:t>
-      </w:r>
-      <w:r>
-        <w:t xml:space="preserve">I have not attached the complete session transcripts because the sessions also covered unrelated work and personal</w:t>
-      </w:r>
-      <w:r>
-        <w:t xml:space="preserve"> </w:t>
-      </w:r>
-      <w:r>
-        <w:t xml:space="preserve">matters; I am glad to answer questions or provide relevant excerpts on request.</w:t>
       </w:r>
     </w:p>
     <w:p>

</xml_diff>

<commit_message>
i-JMR cover letter: drop the editorial-role sentence
Co-Authored-By: Claude Opus 5.5 <noreply@anthropic.com>
</commit_message>
<xml_diff>
--- a/submission/ijmr/cover-letter.docx
+++ b/submission/ijmr/cover-letter.docx
@@ -233,13 +233,7 @@
         <w:t xml:space="preserve"> </w:t>
       </w:r>
       <w:r>
-        <w:t xml:space="preserve">independently of that employment with public data only, and the manuscript discloses this. I hold no editorial role</w:t>
-      </w:r>
-      <w:r>
-        <w:t xml:space="preserve"> </w:t>
-      </w:r>
-      <w:r>
-        <w:t xml:space="preserve">at JMIR Publications.</w:t>
+        <w:t xml:space="preserve">independently of that employment with public data only, and the manuscript discloses this.</w:t>
       </w:r>
     </w:p>
     <w:p>

</xml_diff>

<commit_message>
i-JMR cover letter: fee without the amount; transfer to another JMIR journal such as JMIRx Med
Co-Authored-By: Claude Opus 5.5 <noreply@anthropic.com>
</commit_message>
<xml_diff>
--- a/submission/ijmr/cover-letter.docx
+++ b/submission/ijmr/cover-letter.docx
@@ -247,7 +247,7 @@
         <w:t xml:space="preserve"> </w:t>
       </w:r>
       <w:r>
-        <w:t xml:space="preserve">section). I acknowledge that the article processing fee of US $1985 is payable on acceptance and that I will pay it</w:t>
+        <w:t xml:space="preserve">section). I acknowledge that the article processing fee is payable on acceptance and that I will pay it</w:t>
       </w:r>
       <w:r>
         <w:t xml:space="preserve"> </w:t>
@@ -259,7 +259,7 @@
         <w:t xml:space="preserve"> </w:t>
       </w:r>
       <w:r>
-        <w:t xml:space="preserve">If the manuscript is not accepted, I would welcome a transfer to JMIRx Med.</w:t>
+        <w:t xml:space="preserve">If the manuscript is not accepted, I would welcome a transfer to another JMIR journal such as JMIRx Med.</w:t>
       </w:r>
     </w:p>
     <w:p>

</xml_diff>

<commit_message>
i-JMR cover letter: lead with the gap, three contributions to the literature, and the methods (Bayesian with frequentist agreement)
Co-Authored-By: Claude Opus 5.5 <noreply@anthropic.com>
</commit_message>
<xml_diff>
--- a/submission/ijmr/cover-letter.docx
+++ b/submission/ijmr/cover-letter.docx
@@ -105,31 +105,31 @@
         <w:pStyle w:val="BodyText"/>
       </w:pPr>
       <w:r>
-        <w:t xml:space="preserve">In the Medicare Shared Savings Program, an accountable care organization’s benchmark is reset at each new agreement</w:t>
-      </w:r>
-      <w:r>
-        <w:t xml:space="preserve"> </w:t>
-      </w:r>
-      <w:r>
-        <w:t xml:space="preserve">from its own recent spending, adjusted toward its region’s. The 2019 rules let organizations end an agreement early to</w:t>
-      </w:r>
-      <w:r>
-        <w:t xml:space="preserve"> </w:t>
-      </w:r>
-      <w:r>
-        <w:t xml:space="preserve">reset sooner, and 29 of 334 eligible organizations did so in 2022. To my knowledge, which organizations used this</w:t>
-      </w:r>
-      <w:r>
-        <w:t xml:space="preserve"> </w:t>
-      </w:r>
-      <w:r>
-        <w:t xml:space="preserve">option has not been studied in the peer-reviewed literature, and it bears on how benchmark rules sort organizations</w:t>
-      </w:r>
-      <w:r>
-        <w:t xml:space="preserve"> </w:t>
-      </w:r>
-      <w:r>
-        <w:t xml:space="preserve">into the program.</w:t>
+        <w:t xml:space="preserve">In the Medicare Shared Savings Program, benchmarks decide whether an accountable care organization earns shared</w:t>
+      </w:r>
+      <w:r>
+        <w:t xml:space="preserve"> </w:t>
+      </w:r>
+      <w:r>
+        <w:t xml:space="preserve">savings, and how they are reset shapes which organizations join, stay and save. Earlier studies found that regional benchmarking shifted participation toward providers with low spending</w:t>
+      </w:r>
+      <w:r>
+        <w:t xml:space="preserve"> </w:t>
+      </w:r>
+      <w:r>
+        <w:t xml:space="preserve">relative to their regions, and that organizations whose benchmarks fell were more likely to leave. The 2019 rules added a third</w:t>
+      </w:r>
+      <w:r>
+        <w:t xml:space="preserve"> </w:t>
+      </w:r>
+      <w:r>
+        <w:t xml:space="preserve">choice: ending an agreement early to reset the benchmark sooner. Twenty-nine of 334 eligible organizations did so in</w:t>
+      </w:r>
+      <w:r>
+        <w:t xml:space="preserve"> </w:t>
+      </w:r>
+      <w:r>
+        <w:t xml:space="preserve">2022; to my knowledge, who used this option has not been studied in the peer-reviewed literature.</w:t>
       </w:r>
     </w:p>
     <w:p>
@@ -137,49 +137,43 @@
         <w:pStyle w:val="BodyText"/>
       </w:pPr>
       <w:r>
-        <w:t xml:space="preserve">The study is a preregistered retrospective cohort study of public Centers for Medicare &amp; Medicaid Services files. The</w:t>
-      </w:r>
-      <w:r>
-        <w:t xml:space="preserve"> </w:t>
-      </w:r>
-      <w:r>
-        <w:t xml:space="preserve">analysis plan, decision rules and code were registered on OSF Registries (osf.io/c53w9) before any outcome data were</w:t>
-      </w:r>
-      <w:r>
-        <w:t xml:space="preserve"> </w:t>
-      </w:r>
-      <w:r>
-        <w:t xml:space="preserve">read. The reset benchmark was rebuilt from the regulation and validated against published benchmarks before use. Early</w:t>
-      </w:r>
-      <w:r>
-        <w:t xml:space="preserve"> </w:t>
-      </w:r>
-      <w:r>
-        <w:t xml:space="preserve">renewers’ regions spent more relative to their current benchmarks than stayers’ regions did, and early renewers were</w:t>
-      </w:r>
-      <w:r>
-        <w:t xml:space="preserve"> </w:t>
-      </w:r>
-      <w:r>
-        <w:t xml:space="preserve">more often at the higher, two-sided risk levels, for which renewal opened a 75% sharing rate. Because they were also</w:t>
-      </w:r>
-      <w:r>
-        <w:t xml:space="preserve"> </w:t>
-      </w:r>
-      <w:r>
-        <w:t xml:space="preserve">beating their benchmarks by more, a reset would not on average have raised their benchmarks, and the benchmarks</w:t>
-      </w:r>
-      <w:r>
-        <w:t xml:space="preserve"> </w:t>
-      </w:r>
-      <w:r>
-        <w:t xml:space="preserve">published for 2022 confirm this. Spending growth afterward did not differ detectably. These results describe selection</w:t>
-      </w:r>
-      <w:r>
-        <w:t xml:space="preserve"> </w:t>
-      </w:r>
-      <w:r>
-        <w:t xml:space="preserve">under benchmark rules that were revised in 2024.</w:t>
+        <w:t xml:space="preserve">The study adds three findings. First, early renewers were already low-cost relative to their regions and, in the</w:t>
+      </w:r>
+      <w:r>
+        <w:t xml:space="preserve"> </w:t>
+      </w:r>
+      <w:r>
+        <w:t xml:space="preserve">BASIC track, more often already bearing two-sided risk, for whom renewal was the only route to the 75% sharing rate</w:t>
+      </w:r>
+      <w:r>
+        <w:t xml:space="preserve"> </w:t>
+      </w:r>
+      <w:r>
+        <w:t xml:space="preserve">of the ENHANCED track. Second, the simple account that organizations reset to raise their benchmarks does not hold on</w:t>
+      </w:r>
+      <w:r>
+        <w:t xml:space="preserve"> </w:t>
+      </w:r>
+      <w:r>
+        <w:t xml:space="preserve">average: because early renewers were beating their benchmarks, the own-spending part of a reset offset its regional</w:t>
+      </w:r>
+      <w:r>
+        <w:t xml:space="preserve"> </w:t>
+      </w:r>
+      <w:r>
+        <w:t xml:space="preserve">gain, and the benchmarks published for 2022, examined post hoc, averaged 1.3% below the year before. Third, spending growth after renewal did not</w:t>
+      </w:r>
+      <w:r>
+        <w:t xml:space="preserve"> </w:t>
+      </w:r>
+      <w:r>
+        <w:t xml:space="preserve">differ detectably. The results bear on current policy: rules in force since 2024 credit prior</w:t>
+      </w:r>
+      <w:r>
+        <w:t xml:space="preserve"> </w:t>
+      </w:r>
+      <w:r>
+        <w:t xml:space="preserve">savings, changing this trade-off.</w:t>
       </w:r>
     </w:p>
     <w:p>
@@ -187,19 +181,37 @@
         <w:pStyle w:val="BodyText"/>
       </w:pPr>
       <w:r>
-        <w:t xml:space="preserve">Preprint: the manuscript was submitted to medRxiv on October 27, 2026 (MEDRXIV/2026/366643) and is in screening. I</w:t>
-      </w:r>
-      <w:r>
-        <w:t xml:space="preserve"> </w:t>
-      </w:r>
-      <w:r>
-        <w:t xml:space="preserve">am happy for the submitted version to be posted on JMIR Preprints as well. It has not been submitted to any other</w:t>
-      </w:r>
-      <w:r>
-        <w:t xml:space="preserve"> </w:t>
-      </w:r>
-      <w:r>
-        <w:t xml:space="preserve">journal.</w:t>
+        <w:t xml:space="preserve">The methods are part of the contribution. The plan, decision rules and code were registered on OSF Registries</w:t>
+      </w:r>
+      <w:r>
+        <w:t xml:space="preserve"> </w:t>
+      </w:r>
+      <w:r>
+        <w:t xml:space="preserve">(osf.io/c53w9) before any outcome data were read, and the code enforced that order. The counterfactual benchmark, which is not</w:t>
+      </w:r>
+      <w:r>
+        <w:t xml:space="preserve"> </w:t>
+      </w:r>
+      <w:r>
+        <w:t xml:space="preserve">published, was rebuilt from the regulation and validated before use. The registered estimates are Bayesian, with permutation and simulation tests and a decision model that carries</w:t>
+      </w:r>
+      <w:r>
+        <w:t xml:space="preserve"> </w:t>
+      </w:r>
+      <w:r>
+        <w:t xml:space="preserve">the rebuilt benchmark’s measurement error; every registered conclusion agreed with its conventional frequentist</w:t>
+      </w:r>
+      <w:r>
+        <w:t xml:space="preserve"> </w:t>
+      </w:r>
+      <w:r>
+        <w:t xml:space="preserve">counterpart, so the conclusions do not depend on the</w:t>
+      </w:r>
+      <w:r>
+        <w:t xml:space="preserve"> </w:t>
+      </w:r>
+      <w:r>
+        <w:t xml:space="preserve">inferential framework.</w:t>
       </w:r>
     </w:p>
     <w:p>
@@ -207,19 +219,19 @@
         <w:pStyle w:val="BodyText"/>
       </w:pPr>
       <w:r>
-        <w:t xml:space="preserve">Generative AI: I used Claude Code (Anthropic) to draft analysis code, the scripts that build the tables and figures,</w:t>
-      </w:r>
-      <w:r>
-        <w:t xml:space="preserve"> </w:t>
-      </w:r>
-      <w:r>
-        <w:t xml:space="preserve">and most of the text, which I revised; separate instances of it reviewed the plan, the code and the manuscript before submission.</w:t>
-      </w:r>
-      <w:r>
-        <w:t xml:space="preserve"> </w:t>
-      </w:r>
-      <w:r>
-        <w:t xml:space="preserve">The submission form’s AI disclosure describes this use.</w:t>
+        <w:t xml:space="preserve">Preprint: the manuscript was submitted to medRxiv on October 27, 2026 (MEDRXIV/2026/366643) and is in screening. It may also</w:t>
+      </w:r>
+      <w:r>
+        <w:t xml:space="preserve"> </w:t>
+      </w:r>
+      <w:r>
+        <w:t xml:space="preserve">be posted on JMIR Preprints. It has not been submitted to any other</w:t>
+      </w:r>
+      <w:r>
+        <w:t xml:space="preserve"> </w:t>
+      </w:r>
+      <w:r>
+        <w:t xml:space="preserve">journal.</w:t>
       </w:r>
     </w:p>
     <w:p>
@@ -227,13 +239,25 @@
         <w:pStyle w:val="BodyText"/>
       </w:pPr>
       <w:r>
-        <w:t xml:space="preserve">Conflicts of interest: I am employed as a data scientist at Indiana University Health; the study was conducted</w:t>
-      </w:r>
-      <w:r>
-        <w:t xml:space="preserve"> </w:t>
-      </w:r>
-      <w:r>
-        <w:t xml:space="preserve">independently of that employment with public data only, and the manuscript discloses this.</w:t>
+        <w:t xml:space="preserve">Generative AI: I used Claude Code (Anthropic) to draft analysis code, the scripts that build the tables and figures,</w:t>
+      </w:r>
+      <w:r>
+        <w:t xml:space="preserve"> </w:t>
+      </w:r>
+      <w:r>
+        <w:t xml:space="preserve">and most of the text, which I revised; separate instances</w:t>
+      </w:r>
+      <w:r>
+        <w:t xml:space="preserve"> </w:t>
+      </w:r>
+      <w:r>
+        <w:t xml:space="preserve">reviewed the plan, code and manuscript before submission.</w:t>
+      </w:r>
+      <w:r>
+        <w:t xml:space="preserve"> </w:t>
+      </w:r>
+      <w:r>
+        <w:t xml:space="preserve">The submission form’s AI disclosure describes this use.</w:t>
       </w:r>
     </w:p>
     <w:p>
@@ -241,13 +265,21 @@
         <w:pStyle w:val="BodyText"/>
       </w:pPr>
       <w:r>
-        <w:t xml:space="preserve">All data are public, and the code, data snapshot and results are openly available (links in the Data Availability</w:t>
-      </w:r>
-      <w:r>
-        <w:t xml:space="preserve"> </w:t>
-      </w:r>
-      <w:r>
-        <w:t xml:space="preserve">section). I acknowledge that the article processing fee is payable on acceptance and that I will pay it</w:t>
+        <w:t xml:space="preserve">Conflicts of interest: I am employed as a data scientist at Indiana University Health; the study was</w:t>
+      </w:r>
+      <w:r>
+        <w:t xml:space="preserve"> </w:t>
+      </w:r>
+      <w:r>
+        <w:t xml:space="preserve">independent of that employment, and the manuscript discloses this.</w:t>
+      </w:r>
+    </w:p>
+    <w:p>
+      <w:pPr>
+        <w:pStyle w:val="BodyText"/>
+      </w:pPr>
+      <w:r>
+        <w:t xml:space="preserve">All data, code and results are openly available. I acknowledge that the article processing fee is payable on acceptance and that I will pay it</w:t>
       </w:r>
       <w:r>
         <w:t xml:space="preserve"> </w:t>

</xml_diff>

<commit_message>
i-JMR cover letter: state each finding as a contribution to the literature; acknowledge the industry report
Co-Authored-By: Claude Opus 5.5 <noreply@anthropic.com>
</commit_message>
<xml_diff>
--- a/submission/ijmr/cover-letter.docx
+++ b/submission/ijmr/cover-letter.docx
@@ -75,7 +75,7 @@
         <w:t xml:space="preserve"> </w:t>
       </w:r>
       <w:r>
-        <w:t xml:space="preserve">for publication in the</w:t>
+        <w:t xml:space="preserve">for the</w:t>
       </w:r>
       <w:r>
         <w:t xml:space="preserve"> </w:t>
@@ -111,25 +111,31 @@
         <w:t xml:space="preserve"> </w:t>
       </w:r>
       <w:r>
-        <w:t xml:space="preserve">savings, and how they are reset shapes which organizations join, stay and save. Earlier studies found that regional benchmarking shifted participation toward providers with low spending</w:t>
-      </w:r>
-      <w:r>
-        <w:t xml:space="preserve"> </w:t>
-      </w:r>
-      <w:r>
-        <w:t xml:space="preserve">relative to their regions, and that organizations whose benchmarks fell were more likely to leave. The 2019 rules added a third</w:t>
-      </w:r>
-      <w:r>
-        <w:t xml:space="preserve"> </w:t>
-      </w:r>
-      <w:r>
-        <w:t xml:space="preserve">choice: ending an agreement early to reset the benchmark sooner. Twenty-nine of 334 eligible organizations did so in</w:t>
-      </w:r>
-      <w:r>
-        <w:t xml:space="preserve"> </w:t>
-      </w:r>
-      <w:r>
-        <w:t xml:space="preserve">2022; to my knowledge, who used this option has not been studied in the peer-reviewed literature.</w:t>
+        <w:t xml:space="preserve">savings and shape which organizations join, stay and save. Earlier studies found that regional</w:t>
+      </w:r>
+      <w:r>
+        <w:t xml:space="preserve"> </w:t>
+      </w:r>
+      <w:r>
+        <w:t xml:space="preserve">benchmarking shifted participation toward providers with low spending relative to their regions, and that</w:t>
+      </w:r>
+      <w:r>
+        <w:t xml:space="preserve"> </w:t>
+      </w:r>
+      <w:r>
+        <w:t xml:space="preserve">organizations whose benchmarks fell were more likely to leave. The 2019 rules added a third choice: ending an</w:t>
+      </w:r>
+      <w:r>
+        <w:t xml:space="preserve"> </w:t>
+      </w:r>
+      <w:r>
+        <w:t xml:space="preserve">agreement early to reset the benchmark sooner. Twenty-nine of 334 eligible organizations did so in 2022. An industry</w:t>
+      </w:r>
+      <w:r>
+        <w:t xml:space="preserve"> </w:t>
+      </w:r>
+      <w:r>
+        <w:t xml:space="preserve">report has described them, but to my knowledge who used this option has not been studied in peer-reviewed work.</w:t>
       </w:r>
     </w:p>
     <w:p>
@@ -137,43 +143,43 @@
         <w:pStyle w:val="BodyText"/>
       </w:pPr>
       <w:r>
-        <w:t xml:space="preserve">The study adds three findings. First, early renewers were already low-cost relative to their regions and, in the</w:t>
-      </w:r>
-      <w:r>
-        <w:t xml:space="preserve"> </w:t>
-      </w:r>
-      <w:r>
-        <w:t xml:space="preserve">BASIC track, more often already bearing two-sided risk, for whom renewal was the only route to the 75% sharing rate</w:t>
-      </w:r>
-      <w:r>
-        <w:t xml:space="preserve"> </w:t>
-      </w:r>
-      <w:r>
-        <w:t xml:space="preserve">of the ENHANCED track. Second, the simple account that organizations reset to raise their benchmarks does not hold on</w:t>
-      </w:r>
-      <w:r>
-        <w:t xml:space="preserve"> </w:t>
-      </w:r>
-      <w:r>
-        <w:t xml:space="preserve">average: because early renewers were beating their benchmarks, the own-spending part of a reset offset its regional</w:t>
-      </w:r>
-      <w:r>
-        <w:t xml:space="preserve"> </w:t>
-      </w:r>
-      <w:r>
-        <w:t xml:space="preserve">gain, and the benchmarks published for 2022, examined post hoc, averaged 1.3% below the year before. Third, spending growth after renewal did not</w:t>
-      </w:r>
-      <w:r>
-        <w:t xml:space="preserve"> </w:t>
-      </w:r>
-      <w:r>
-        <w:t xml:space="preserve">differ detectably. The results bear on current policy: rules in force since 2024 credit prior</w:t>
-      </w:r>
-      <w:r>
-        <w:t xml:space="preserve"> </w:t>
-      </w:r>
-      <w:r>
-        <w:t xml:space="preserve">savings, changing this trade-off.</w:t>
+        <w:t xml:space="preserve">The study makes three contributions. First, it extends the evidence that participation follows the benchmark formula</w:t>
+      </w:r>
+      <w:r>
+        <w:t xml:space="preserve"> </w:t>
+      </w:r>
+      <w:r>
+        <w:t xml:space="preserve">from whether organizations join or leave to when they reset: early renewers were already low-cost relative to their</w:t>
+      </w:r>
+      <w:r>
+        <w:t xml:space="preserve"> </w:t>
+      </w:r>
+      <w:r>
+        <w:t xml:space="preserve">regions and, in the BASIC track, more often bearing two-sided risk, for whom renewal was the only route to a 75%</w:t>
+      </w:r>
+      <w:r>
+        <w:t xml:space="preserve"> </w:t>
+      </w:r>
+      <w:r>
+        <w:t xml:space="preserve">sharing rate. Second, it finds that the intuitive account, renewing early to raise the</w:t>
+      </w:r>
+      <w:r>
+        <w:t xml:space="preserve"> </w:t>
+      </w:r>
+      <w:r>
+        <w:t xml:space="preserve">benchmark, does not hold on average: the own-spending part of a reset offset its regional gain, and their 2022 benchmarks, examined post hoc, averaged 1.3% below the year before. Third, spending growth after renewal did not differ</w:t>
+      </w:r>
+      <w:r>
+        <w:t xml:space="preserve"> </w:t>
+      </w:r>
+      <w:r>
+        <w:t xml:space="preserve">detectably. The findings also give a baseline for</w:t>
+      </w:r>
+      <w:r>
+        <w:t xml:space="preserve"> </w:t>
+      </w:r>
+      <w:r>
+        <w:t xml:space="preserve">evaluating the 2024 rules, which credit prior savings.</w:t>
       </w:r>
     </w:p>
     <w:p>
@@ -187,13 +193,13 @@
         <w:t xml:space="preserve"> </w:t>
       </w:r>
       <w:r>
-        <w:t xml:space="preserve">(osf.io/c53w9) before any outcome data were read, and the code enforced that order. The counterfactual benchmark, which is not</w:t>
-      </w:r>
-      <w:r>
-        <w:t xml:space="preserve"> </w:t>
-      </w:r>
-      <w:r>
-        <w:t xml:space="preserve">published, was rebuilt from the regulation and validated before use. The registered estimates are Bayesian, with permutation and simulation tests and a decision model that carries</w:t>
+        <w:t xml:space="preserve">(osf.io/c53w9) before any outcome data were read, and the code enforced that order. The unpublished counterfactual benchmark was</w:t>
+      </w:r>
+      <w:r>
+        <w:t xml:space="preserve"> </w:t>
+      </w:r>
+      <w:r>
+        <w:t xml:space="preserve">rebuilt from the regulation and validated before use. The registered estimates are Bayesian, with permutation and simulation tests and a decision model that carries</w:t>
       </w:r>
       <w:r>
         <w:t xml:space="preserve"> </w:t>
@@ -239,13 +245,13 @@
         <w:pStyle w:val="BodyText"/>
       </w:pPr>
       <w:r>
-        <w:t xml:space="preserve">Generative AI: I used Claude Code (Anthropic) to draft analysis code, the scripts that build the tables and figures,</w:t>
-      </w:r>
-      <w:r>
-        <w:t xml:space="preserve"> </w:t>
-      </w:r>
-      <w:r>
-        <w:t xml:space="preserve">and most of the text, which I revised; separate instances</w:t>
+        <w:t xml:space="preserve">Generative AI: I used Claude Code (Anthropic) to draft the analysis code, the table and</w:t>
+      </w:r>
+      <w:r>
+        <w:t xml:space="preserve"> </w:t>
+      </w:r>
+      <w:r>
+        <w:t xml:space="preserve">figure scripts, and most of the text, which I revised; separate instances</w:t>
       </w:r>
       <w:r>
         <w:t xml:space="preserve"> </w:t>
@@ -299,7 +305,7 @@
         <w:pStyle w:val="BodyText"/>
       </w:pPr>
       <w:r>
-        <w:t xml:space="preserve">Thank you for considering this work.</w:t>
+        <w:t xml:space="preserve">Thank you for your consideration.</w:t>
       </w:r>
     </w:p>
     <w:p>

</xml_diff>

<commit_message>
i-JMR submission 115640 recorded (2026-10-28); package files as submitted
Co-Authored-By: Claude Opus 5.5 <noreply@anthropic.com>
</commit_message>
<xml_diff>
--- a/submission/ijmr/cover-letter.docx
+++ b/submission/ijmr/cover-letter.docx
@@ -7,7 +7,7 @@
         <w:pStyle w:val="FirstParagraph"/>
       </w:pPr>
       <w:r>
-        <w:t xml:space="preserve">Samuel Thomas Harrold</w:t>
+        <w:t xml:space="preserve">Samuel Harrold</w:t>
       </w:r>
       <w:r>
         <w:br/>
@@ -333,13 +333,15 @@
         <w:pStyle w:val="BodyText"/>
       </w:pPr>
       <w:r>
-        <w:t xml:space="preserve">Samuel Thomas Harrold</w:t>
+        <w:t xml:space="preserve">Samuel Harrold</w:t>
       </w:r>
     </w:p>
     <w:sectPr>
       <w:footnotePr>
         <w:numRestart w:val="eachSect"/>
       </w:footnotePr>
+      <w:pgSz w:h="15840" w:w="12240"/>
+      <w:pgMar w:bottom="1440" w:footer="720" w:gutter="0" w:header="720" w:left="1440" w:right="1440" w:top="1440"/>
     </w:sectPr>
   </w:body>
 </w:document>
@@ -502,8 +504,12 @@
     <w:basedOn w:val="BodyText"/>
     <w:qFormat/>
     <w:pPr>
-      <w:spacing w:after="36" w:before="36"/>
-    </w:pPr>
+      <w:spacing w:after="20" w:before="20" w:line="240" w:lineRule="auto"/>
+    </w:pPr>
+    <w:rPr>
+      <w:sz w:val="20"/>
+      <w:szCs w:val="20"/>
+    </w:rPr>
   </w:style>
   <w:style w:styleId="Title" w:type="paragraph">
     <w:name w:val="Title"/>

</xml_diff>